<commit_message>
quarto-vcci step 2: vcci-report consulting report (approved)
- Cover after VCCI_Report.dotx (lockup, label, title, blue field with
  drum ring, gold rule, client, hero icon), imprint page, contents,
  chapters on a new page with "CHƯƠNG 01" label and gold rule, running
  header and "Trang X / N" footer, back cover with the logo on a Paper
  plate. Draft/confidential mark, key-figure cards, VCCI status colours
  for Quarto callouts, tables that break across pages, APA citations.
  Word output numbers chapters only, as the PDF does. A4 throughout.
- templates/report.qmd and examples/report.pdf, report.docx.
- Tests (87/87): stress fixture; text must be visible (text pushed off
  a page counts as missing) and must not overlap; Word opens each .docx
  and exports an A4 PDF set in brand fonts; installation with quarto
  add; page images compared with the approved baseline; self-tests for
  every new check.

Co-Authored-By: Claude Opus 5.5 <noreply@anthropic.com>
</commit_message>
<xml_diff>
--- a/quarto-vcci/_extensions/vcci/vcci-report/vcci-reference.docx
+++ b/quarto-vcci/_extensions/vcci/vcci-report/vcci-reference.docx
@@ -11,7 +11,7 @@
           <w:noProof/>
         </w:rPr>
         <w:drawing>
-          <wp:anchor distT="0" distB="0" distL="0" distR="0" simplePos="0" relativeHeight="251657216" behindDoc="1" locked="1" layoutInCell="1" allowOverlap="1" wp14:anchorId="0CFEA1CA" wp14:editId="1F916B72">
+          <wp:anchor distT="0" distB="0" distL="0" distR="0" simplePos="0" relativeHeight="251657216" behindDoc="1" locked="1" layoutInCell="1" allowOverlap="1" wp14:anchorId="5FEE9549" wp14:editId="5EE1FB3E">
             <wp:simplePos x="0" y="0"/>
             <wp:positionH relativeFrom="page">
               <wp:posOffset>0</wp:posOffset>
@@ -62,7 +62,7 @@
           <w:noProof/>
         </w:rPr>
         <w:drawing>
-          <wp:inline distT="0" distB="0" distL="0" distR="0" wp14:anchorId="28D3BC92" wp14:editId="5DF603CE">
+          <wp:inline distT="0" distB="0" distL="0" distR="0" wp14:anchorId="1E705EAE" wp14:editId="57ECF4ED">
             <wp:extent cx="3456000" cy="486720"/>
             <wp:effectExtent l="0" t="0" r="0" b="0"/>
             <wp:docPr id="5" name="Picture 5"/>
@@ -226,7 +226,7 @@
           <w:left w:w="10" w:type="dxa"/>
           <w:right w:w="10" w:type="dxa"/>
         </w:tblCellMar>
-        <w:tblLook w:val="04A0" w:firstRow="1" w:lastRow="0" w:firstColumn="1" w:lastColumn="0" w:noHBand="0" w:noVBand="1"/>
+        <w:tblLook w:val="0000" w:firstRow="0" w:lastRow="0" w:firstColumn="0" w:lastColumn="0" w:noHBand="0" w:noVBand="0"/>
       </w:tblPr>
       <w:tblGrid>
         <w:gridCol w:w="8504"/>
@@ -386,7 +386,7 @@
                 <w:noProof/>
               </w:rPr>
               <w:drawing>
-                <wp:inline distT="0" distB="0" distL="0" distR="0" wp14:anchorId="41FCDCB6" wp14:editId="1CAC1B05">
+                <wp:inline distT="0" distB="0" distL="0" distR="0" wp14:anchorId="387D1F62" wp14:editId="3329D309">
                   <wp:extent cx="936000" cy="936000"/>
                   <wp:effectExtent l="0" t="0" r="0" b="0"/>
                   <wp:docPr id="6" name="Picture 6"/>
@@ -471,7 +471,7 @@
     <w:sdt>
       <w:sdtPr>
         <w:alias w:val="Mục lục"/>
-        <w:id w:val="-383726480"/>
+        <w:id w:val="-1128933521"/>
       </w:sdtPr>
       <w:sdtEndPr>
         <w:rPr>
@@ -507,7 +507,7 @@
           <w:r>
             <w:fldChar w:fldCharType="separate"/>
           </w:r>
-          <w:hyperlink w:anchor="_Toc242495987" w:history="1">
+          <w:hyperlink w:anchor="_Toc242507959" w:history="1">
             <w:r>
               <w:rPr>
                 <w:rStyle w:val="Hyperlink"/>
@@ -531,7 +531,7 @@
               <w:rPr>
                 <w:noProof/>
               </w:rPr>
-              <w:instrText xml:space="preserve"> PAGEREF _Toc242495987 \h </w:instrText>
+              <w:instrText xml:space="preserve"> PAGEREF _Toc242507959 \h </w:instrText>
             </w:r>
             <w:r>
               <w:rPr>
@@ -574,7 +574,7 @@
               <w14:ligatures w14:val="standardContextual"/>
             </w:rPr>
           </w:pPr>
-          <w:hyperlink w:anchor="_Toc242495988" w:history="1">
+          <w:hyperlink w:anchor="_Toc242507960" w:history="1">
             <w:r>
               <w:rPr>
                 <w:rStyle w:val="Hyperlink"/>
@@ -598,7 +598,7 @@
               <w:rPr>
                 <w:noProof/>
               </w:rPr>
-              <w:instrText xml:space="preserve"> PAGEREF _Toc242495988 \h </w:instrText>
+              <w:instrText xml:space="preserve"> PAGEREF _Toc242507960 \h </w:instrText>
             </w:r>
             <w:r>
               <w:rPr>
@@ -641,7 +641,7 @@
               <w14:ligatures w14:val="standardContextual"/>
             </w:rPr>
           </w:pPr>
-          <w:hyperlink w:anchor="_Toc242495989" w:history="1">
+          <w:hyperlink w:anchor="_Toc242507961" w:history="1">
             <w:r>
               <w:rPr>
                 <w:rStyle w:val="Hyperlink"/>
@@ -665,7 +665,7 @@
               <w:rPr>
                 <w:noProof/>
               </w:rPr>
-              <w:instrText xml:space="preserve"> PAGEREF _Toc242495989 \h </w:instrText>
+              <w:instrText xml:space="preserve"> PAGEREF _Toc242507961 \h </w:instrText>
             </w:r>
             <w:r>
               <w:rPr>
@@ -708,7 +708,7 @@
               <w14:ligatures w14:val="standardContextual"/>
             </w:rPr>
           </w:pPr>
-          <w:hyperlink w:anchor="_Toc242495990" w:history="1">
+          <w:hyperlink w:anchor="_Toc242507962" w:history="1">
             <w:r>
               <w:rPr>
                 <w:rStyle w:val="Hyperlink"/>
@@ -732,7 +732,7 @@
               <w:rPr>
                 <w:noProof/>
               </w:rPr>
-              <w:instrText xml:space="preserve"> PAGEREF _Toc242495990 \h </w:instrText>
+              <w:instrText xml:space="preserve"> PAGEREF _Toc242507962 \h </w:instrText>
             </w:r>
             <w:r>
               <w:rPr>
@@ -775,7 +775,7 @@
               <w14:ligatures w14:val="standardContextual"/>
             </w:rPr>
           </w:pPr>
-          <w:hyperlink w:anchor="_Toc242495991" w:history="1">
+          <w:hyperlink w:anchor="_Toc242507963" w:history="1">
             <w:r>
               <w:rPr>
                 <w:rStyle w:val="Hyperlink"/>
@@ -799,7 +799,7 @@
               <w:rPr>
                 <w:noProof/>
               </w:rPr>
-              <w:instrText xml:space="preserve"> PAGEREF _Toc242495991 \h </w:instrText>
+              <w:instrText xml:space="preserve"> PAGEREF _Toc242507963 \h </w:instrText>
             </w:r>
             <w:r>
               <w:rPr>
@@ -851,7 +851,7 @@
       <w:pPr>
         <w:pStyle w:val="Heading1"/>
       </w:pPr>
-      <w:bookmarkStart w:id="0" w:name="_Toc242495987"/>
+      <w:bookmarkStart w:id="0" w:name="_Toc242507959"/>
       <w:r>
         <w:t>Tóm t</w:t>
       </w:r>
@@ -872,7 +872,7 @@
           <w:noProof/>
         </w:rPr>
         <w:drawing>
-          <wp:inline distT="0" distB="0" distL="0" distR="0" wp14:anchorId="11954DAF" wp14:editId="27D1F543">
+          <wp:inline distT="0" distB="0" distL="0" distR="0" wp14:anchorId="6691D157" wp14:editId="0318E4FB">
             <wp:extent cx="576000" cy="32400"/>
             <wp:effectExtent l="0" t="0" r="0" b="0"/>
             <wp:docPr id="8" name="Picture 8"/>
@@ -1264,7 +1264,7 @@
       <w:pPr>
         <w:pStyle w:val="Heading2"/>
       </w:pPr>
-      <w:bookmarkStart w:id="1" w:name="_Toc242495988"/>
+      <w:bookmarkStart w:id="1" w:name="_Toc242507960"/>
       <w:r>
         <w:t>Nh</w:t>
       </w:r>
@@ -1498,7 +1498,7 @@
       <w:pPr>
         <w:pStyle w:val="Heading3"/>
       </w:pPr>
-      <w:bookmarkStart w:id="2" w:name="_Toc242495989"/>
+      <w:bookmarkStart w:id="2" w:name="_Toc242507961"/>
       <w:r>
         <w:t>Phương pháp</w:t>
       </w:r>
@@ -1896,7 +1896,7 @@
       <w:pPr>
         <w:pStyle w:val="Heading1"/>
       </w:pPr>
-      <w:bookmarkStart w:id="3" w:name="_Toc242495990"/>
+      <w:bookmarkStart w:id="3" w:name="_Toc242507962"/>
       <w:r>
         <w:t>Phân tích</w:t>
       </w:r>
@@ -1911,7 +1911,7 @@
           <w:noProof/>
         </w:rPr>
         <w:drawing>
-          <wp:inline distT="0" distB="0" distL="0" distR="0" wp14:anchorId="3CBAD824" wp14:editId="6702BDE2">
+          <wp:inline distT="0" distB="0" distL="0" distR="0" wp14:anchorId="6D1513A6" wp14:editId="5C9FB66D">
             <wp:extent cx="576000" cy="32400"/>
             <wp:effectExtent l="0" t="0" r="0" b="0"/>
             <wp:docPr id="9" name="Picture 9"/>
@@ -2372,7 +2372,7 @@
           <w:noProof/>
         </w:rPr>
         <w:drawing>
-          <wp:inline distT="0" distB="0" distL="0" distR="0" wp14:anchorId="6F3B7B03" wp14:editId="57EB2237">
+          <wp:inline distT="0" distB="0" distL="0" distR="0" wp14:anchorId="76264C62" wp14:editId="364D552C">
             <wp:extent cx="5976621" cy="3063018"/>
             <wp:effectExtent l="0" t="0" r="0" b="0"/>
             <wp:docPr id="10" name="Picture 10"/>
@@ -2477,7 +2477,7 @@
       <w:pPr>
         <w:pStyle w:val="Heading2"/>
       </w:pPr>
-      <w:bookmarkStart w:id="4" w:name="_Toc242495991"/>
+      <w:bookmarkStart w:id="4" w:name="_Toc242507963"/>
       <w:r>
         <w:t>[Tiêu đ</w:t>
       </w:r>
@@ -2643,7 +2643,7 @@
         </w:rPr>
         <w:lastRenderedPageBreak/>
         <w:drawing>
-          <wp:anchor distT="0" distB="0" distL="0" distR="0" simplePos="0" relativeHeight="251658240" behindDoc="1" locked="1" layoutInCell="1" allowOverlap="1" wp14:anchorId="728C8932" wp14:editId="14782E9D">
+          <wp:anchor distT="0" distB="0" distL="0" distR="0" simplePos="0" relativeHeight="251658240" behindDoc="1" locked="1" layoutInCell="1" allowOverlap="1" wp14:anchorId="4FC93F57" wp14:editId="768FDBF2">
             <wp:simplePos x="0" y="0"/>
             <wp:positionH relativeFrom="page">
               <wp:posOffset>0</wp:posOffset>
@@ -2668,7 +2668,7 @@
                     </pic:cNvPicPr>
                   </pic:nvPicPr>
                   <pic:blipFill>
-                    <a:blip r:embed="rId7"/>
+                    <a:blip r:embed="rId18"/>
                     <a:srcRect/>
                     <a:stretch>
                       <a:fillRect/>
@@ -2707,7 +2707,7 @@
           <w:left w:w="10" w:type="dxa"/>
           <w:right w:w="10" w:type="dxa"/>
         </w:tblCellMar>
-        <w:tblLook w:val="04A0" w:firstRow="1" w:lastRow="0" w:firstColumn="1" w:lastColumn="0" w:noHBand="0" w:noVBand="1"/>
+        <w:tblLook w:val="0000" w:firstRow="0" w:lastRow="0" w:firstColumn="0" w:lastColumn="0" w:noHBand="0" w:noVBand="0"/>
       </w:tblPr>
       <w:tblGrid>
         <w:gridCol w:w="8504"/>
@@ -2950,10 +2950,10 @@
       </w:pPr>
     </w:p>
     <w:sectPr>
-      <w:headerReference w:type="default" r:id="rId18"/>
-      <w:footerReference w:type="default" r:id="rId19"/>
-      <w:headerReference w:type="first" r:id="rId20"/>
-      <w:footerReference w:type="first" r:id="rId21"/>
+      <w:headerReference w:type="default" r:id="rId19"/>
+      <w:footerReference w:type="default" r:id="rId20"/>
+      <w:headerReference w:type="first" r:id="rId21"/>
+      <w:footerReference w:type="first" r:id="rId22"/>
       <w:pgSz w:w="11906" w:h="16838"/>
       <w:pgMar w:top="567" w:right="1247" w:bottom="567" w:left="1247" w:header="0" w:footer="0" w:gutter="0"/>
       <w:cols w:space="720"/>
@@ -3121,7 +3121,7 @@
         <w:noProof/>
       </w:rPr>
       <w:drawing>
-        <wp:inline distT="0" distB="0" distL="0" distR="0" wp14:anchorId="3DD5FAB6" wp14:editId="54FFF8A0">
+        <wp:inline distT="0" distB="0" distL="0" distR="0" wp14:anchorId="6869E9B1" wp14:editId="423714A6">
           <wp:extent cx="864000" cy="259920"/>
           <wp:effectExtent l="0" t="0" r="0" b="0"/>
           <wp:docPr id="7" name="Picture 7"/>
@@ -3190,229 +3190,229 @@
 <file path=word/numbering.xml><?xml version="1.0" encoding="utf-8"?>
 <w:numbering xmlns:wpc="http://schemas.microsoft.com/office/word/2010/wordprocessingCanvas" xmlns:cx="http://schemas.microsoft.com/office/drawing/2014/chartex" xmlns:cx1="http://schemas.microsoft.com/office/drawing/2015/9/8/chartex" xmlns:cx2="http://schemas.microsoft.com/office/drawing/2015/10/21/chartex" xmlns:cx3="http://schemas.microsoft.com/office/drawing/2016/5/9/chartex" xmlns:cx4="http://schemas.microsoft.com/office/drawing/2016/5/10/chartex" xmlns:cx5="http://schemas.microsoft.com/office/drawing/2016/5/11/chartex" xmlns:cx6="http://schemas.microsoft.com/office/drawing/2016/5/12/chartex" xmlns:cx7="http://schemas.microsoft.com/office/drawing/2016/5/13/chartex" xmlns:cx8="http://schemas.microsoft.com/office/drawing/2016/5/14/chartex" xmlns:mc="http://schemas.openxmlformats.org/markup-compatibility/2006" xmlns:aink="http://schemas.microsoft.com/office/drawing/2016/ink" xmlns:am3d="http://schemas.microsoft.com/office/drawing/2017/model3d" xmlns:o="urn:schemas-microsoft-com:office:office" xmlns:oel="http://schemas.microsoft.com/office/2019/extlst" xmlns:r="http://schemas.openxmlformats.org/officeDocument/2006/relationships" xmlns:m="http://schemas.openxmlformats.org/officeDocument/2006/math" xmlns:v="urn:schemas-microsoft-com:vml" xmlns:wp14="http://schemas.microsoft.com/office/word/2010/wordprocessingDrawing" xmlns:wp="http://schemas.openxmlformats.org/drawingml/2006/wordprocessingDrawing" xmlns:w10="urn:schemas-microsoft-com:office:word" xmlns:w="http://schemas.openxmlformats.org/wordprocessingml/2006/main" xmlns:w14="http://schemas.microsoft.com/office/word/2010/wordml" xmlns:w15="http://schemas.microsoft.com/office/word/2012/wordml" xmlns:w16cex="http://schemas.microsoft.com/office/word/2018/wordml/cex" xmlns:w16cid="http://schemas.microsoft.com/office/word/2016/wordml/cid" xmlns:w16="http://schemas.microsoft.com/office/word/2018/wordml" xmlns:w16du="http://schemas.microsoft.com/office/word/2023/wordml/word16du" xmlns:w16sdtdh="http://schemas.microsoft.com/office/word/2020/wordml/sdtdatahash" xmlns:w16sdtfl="http://schemas.microsoft.com/office/word/2024/wordml/sdtformatlock" xmlns:w16se="http://schemas.microsoft.com/office/word/2015/wordml/symex" xmlns:wpg="http://schemas.microsoft.com/office/word/2010/wordprocessingGroup" xmlns:wpi="http://schemas.microsoft.com/office/word/2010/wordprocessingInk" xmlns:wne="http://schemas.microsoft.com/office/word/2006/wordml" xmlns:wps="http://schemas.microsoft.com/office/word/2010/wordprocessingShape" mc:Ignorable="w14 w15 w16se w16cid w16 w16cex w16sdtdh w16sdtfl w16du wp14">
   <w:abstractNum w:abstractNumId="0" w15:restartNumberingAfterBreak="0">
-    <w:nsid w:val="01E55102"/>
+    <w:nsid w:val="054D063A"/>
     <w:multiLevelType w:val="hybridMultilevel"/>
-    <w:tmpl w:val="E43A2F56"/>
-    <w:lvl w:ilvl="0" w:tplc="7844481C">
+    <w:tmpl w:val="2E0C0F72"/>
+    <w:lvl w:ilvl="0" w:tplc="02EC8E70">
       <w:start w:val="1"/>
-      <w:numFmt w:val="decimal"/>
-      <w:lvlText w:val="%1."/>
+      <w:numFmt w:val="bullet"/>
+      <w:lvlText w:val="■"/>
       <w:lvlJc w:val="left"/>
       <w:pPr>
-        <w:ind w:left="340" w:hanging="340"/>
+        <w:ind w:left="340" w:hanging="255"/>
       </w:pPr>
       <w:rPr>
-        <w:rFonts w:ascii="Be Vietnam Pro SemiBold" w:eastAsia="Be Vietnam Pro SemiBold" w:hAnsi="Be Vietnam Pro SemiBold" w:cs="Be Vietnam Pro SemiBold"/>
         <w:color w:val="264896"/>
+        <w:sz w:val="12"/>
+        <w:szCs w:val="12"/>
       </w:rPr>
     </w:lvl>
-    <w:lvl w:ilvl="1" w:tplc="C924E8A2">
+    <w:lvl w:ilvl="1" w:tplc="DF2AF266">
+      <w:start w:val="1"/>
+      <w:numFmt w:val="bullet"/>
+      <w:lvlText w:val="–"/>
+      <w:lvlJc w:val="left"/>
+      <w:pPr>
+        <w:ind w:left="680" w:hanging="255"/>
+      </w:pPr>
+      <w:rPr>
+        <w:color w:val="5C6478"/>
+      </w:rPr>
+    </w:lvl>
+    <w:lvl w:ilvl="2" w:tplc="BC24587C">
       <w:numFmt w:val="decimal"/>
       <w:lvlText w:val=""/>
       <w:lvlJc w:val="left"/>
     </w:lvl>
-    <w:lvl w:ilvl="2" w:tplc="22022A9C">
+    <w:lvl w:ilvl="3" w:tplc="13169F24">
       <w:numFmt w:val="decimal"/>
       <w:lvlText w:val=""/>
       <w:lvlJc w:val="left"/>
     </w:lvl>
-    <w:lvl w:ilvl="3" w:tplc="28082FF4">
+    <w:lvl w:ilvl="4" w:tplc="8F1EE764">
       <w:numFmt w:val="decimal"/>
       <w:lvlText w:val=""/>
       <w:lvlJc w:val="left"/>
     </w:lvl>
-    <w:lvl w:ilvl="4" w:tplc="07B89F74">
+    <w:lvl w:ilvl="5" w:tplc="648E0E0C">
       <w:numFmt w:val="decimal"/>
       <w:lvlText w:val=""/>
       <w:lvlJc w:val="left"/>
     </w:lvl>
-    <w:lvl w:ilvl="5" w:tplc="99222E50">
+    <w:lvl w:ilvl="6" w:tplc="5EFA1E9E">
       <w:numFmt w:val="decimal"/>
       <w:lvlText w:val=""/>
       <w:lvlJc w:val="left"/>
     </w:lvl>
-    <w:lvl w:ilvl="6" w:tplc="20522A3E">
+    <w:lvl w:ilvl="7" w:tplc="FF4A8832">
       <w:numFmt w:val="decimal"/>
       <w:lvlText w:val=""/>
       <w:lvlJc w:val="left"/>
     </w:lvl>
-    <w:lvl w:ilvl="7" w:tplc="FA787012">
-      <w:numFmt w:val="decimal"/>
-      <w:lvlText w:val=""/>
-      <w:lvlJc w:val="left"/>
-    </w:lvl>
-    <w:lvl w:ilvl="8" w:tplc="02EA4B2C">
+    <w:lvl w:ilvl="8" w:tplc="6F94EA6E">
       <w:numFmt w:val="decimal"/>
       <w:lvlText w:val=""/>
       <w:lvlJc w:val="left"/>
     </w:lvl>
   </w:abstractNum>
   <w:abstractNum w:abstractNumId="1" w15:restartNumberingAfterBreak="0">
-    <w:nsid w:val="114A7B90"/>
+    <w:nsid w:val="393D0AC7"/>
     <w:multiLevelType w:val="hybridMultilevel"/>
-    <w:tmpl w:val="A1968518"/>
-    <w:lvl w:ilvl="0" w:tplc="8E2E228E" w:tentative="1">
+    <w:tmpl w:val="4152571A"/>
+    <w:lvl w:ilvl="0" w:tplc="E3E420F0">
       <w:start w:val="1"/>
-      <w:numFmt w:val="bullet"/>
-      <w:lvlText w:val="●"/>
+      <w:numFmt w:val="decimal"/>
+      <w:lvlText w:val="%1."/>
       <w:lvlJc w:val="left"/>
       <w:pPr>
-        <w:ind w:left="720" w:hanging="360"/>
-      </w:pPr>
-    </w:lvl>
-    <w:lvl w:ilvl="1" w:tplc="12B4F484" w:tentative="1">
-      <w:start w:val="1"/>
-      <w:numFmt w:val="bullet"/>
-      <w:lvlText w:val="○"/>
-      <w:lvlJc w:val="left"/>
-      <w:pPr>
-        <w:ind w:left="1440" w:hanging="360"/>
-      </w:pPr>
-    </w:lvl>
-    <w:lvl w:ilvl="2" w:tplc="EE1C2B8C" w:tentative="1">
-      <w:start w:val="1"/>
-      <w:numFmt w:val="bullet"/>
-      <w:lvlText w:val="■"/>
-      <w:lvlJc w:val="left"/>
-      <w:pPr>
-        <w:ind w:left="2160" w:hanging="360"/>
-      </w:pPr>
-    </w:lvl>
-    <w:lvl w:ilvl="3" w:tplc="17BE3E30" w:tentative="1">
-      <w:start w:val="1"/>
-      <w:numFmt w:val="bullet"/>
-      <w:lvlText w:val="●"/>
-      <w:lvlJc w:val="left"/>
-      <w:pPr>
-        <w:ind w:left="2880" w:hanging="360"/>
-      </w:pPr>
-    </w:lvl>
-    <w:lvl w:ilvl="4" w:tplc="3A006D4E" w:tentative="1">
-      <w:start w:val="1"/>
-      <w:numFmt w:val="bullet"/>
-      <w:lvlText w:val="○"/>
-      <w:lvlJc w:val="left"/>
-      <w:pPr>
-        <w:ind w:left="3600" w:hanging="360"/>
-      </w:pPr>
-    </w:lvl>
-    <w:lvl w:ilvl="5" w:tplc="DC3CA320" w:tentative="1">
-      <w:start w:val="1"/>
-      <w:numFmt w:val="bullet"/>
-      <w:lvlText w:val="■"/>
-      <w:lvlJc w:val="left"/>
-      <w:pPr>
-        <w:ind w:left="4320" w:hanging="360"/>
-      </w:pPr>
-    </w:lvl>
-    <w:lvl w:ilvl="6" w:tplc="75360EBC" w:tentative="1">
-      <w:start w:val="1"/>
-      <w:numFmt w:val="bullet"/>
-      <w:lvlText w:val="●"/>
-      <w:lvlJc w:val="left"/>
-      <w:pPr>
-        <w:ind w:left="5040" w:hanging="360"/>
-      </w:pPr>
-    </w:lvl>
-    <w:lvl w:ilvl="7" w:tplc="A00EE554" w:tentative="1">
-      <w:start w:val="1"/>
-      <w:numFmt w:val="bullet"/>
-      <w:lvlText w:val="●"/>
-      <w:lvlJc w:val="left"/>
-      <w:pPr>
-        <w:ind w:left="5760" w:hanging="360"/>
-      </w:pPr>
-    </w:lvl>
-    <w:lvl w:ilvl="8" w:tplc="74C05DBC" w:tentative="1">
-      <w:start w:val="1"/>
-      <w:numFmt w:val="bullet"/>
-      <w:lvlText w:val="●"/>
-      <w:lvlJc w:val="left"/>
-      <w:pPr>
-        <w:ind w:left="6480" w:hanging="360"/>
-      </w:pPr>
-    </w:lvl>
-  </w:abstractNum>
-  <w:abstractNum w:abstractNumId="2" w15:restartNumberingAfterBreak="0">
-    <w:nsid w:val="4C906FCA"/>
-    <w:multiLevelType w:val="hybridMultilevel"/>
-    <w:tmpl w:val="DF3CA9E0"/>
-    <w:lvl w:ilvl="0" w:tplc="6568BECE">
-      <w:start w:val="1"/>
-      <w:numFmt w:val="bullet"/>
-      <w:lvlText w:val="■"/>
-      <w:lvlJc w:val="left"/>
-      <w:pPr>
-        <w:ind w:left="340" w:hanging="255"/>
+        <w:ind w:left="340" w:hanging="340"/>
       </w:pPr>
       <w:rPr>
+        <w:rFonts w:ascii="Be Vietnam Pro SemiBold" w:eastAsia="Be Vietnam Pro SemiBold" w:hAnsi="Be Vietnam Pro SemiBold" w:cs="Be Vietnam Pro SemiBold"/>
         <w:color w:val="264896"/>
-        <w:sz w:val="12"/>
-        <w:szCs w:val="12"/>
       </w:rPr>
     </w:lvl>
-    <w:lvl w:ilvl="1" w:tplc="7ED29E00">
-      <w:start w:val="1"/>
-      <w:numFmt w:val="bullet"/>
-      <w:lvlText w:val="–"/>
-      <w:lvlJc w:val="left"/>
-      <w:pPr>
-        <w:ind w:left="680" w:hanging="255"/>
-      </w:pPr>
-      <w:rPr>
-        <w:color w:val="5C6478"/>
-      </w:rPr>
-    </w:lvl>
-    <w:lvl w:ilvl="2" w:tplc="EEB2A3DA">
+    <w:lvl w:ilvl="1" w:tplc="0096D978">
       <w:numFmt w:val="decimal"/>
       <w:lvlText w:val=""/>
       <w:lvlJc w:val="left"/>
     </w:lvl>
-    <w:lvl w:ilvl="3" w:tplc="4E184A32">
+    <w:lvl w:ilvl="2" w:tplc="916662A2">
       <w:numFmt w:val="decimal"/>
       <w:lvlText w:val=""/>
       <w:lvlJc w:val="left"/>
     </w:lvl>
-    <w:lvl w:ilvl="4" w:tplc="E8361AA6">
+    <w:lvl w:ilvl="3" w:tplc="59EC34DC">
       <w:numFmt w:val="decimal"/>
       <w:lvlText w:val=""/>
       <w:lvlJc w:val="left"/>
     </w:lvl>
-    <w:lvl w:ilvl="5" w:tplc="CE089442">
+    <w:lvl w:ilvl="4" w:tplc="3BE41D74">
       <w:numFmt w:val="decimal"/>
       <w:lvlText w:val=""/>
       <w:lvlJc w:val="left"/>
     </w:lvl>
-    <w:lvl w:ilvl="6" w:tplc="0E04ED1C">
+    <w:lvl w:ilvl="5" w:tplc="65223B9A">
       <w:numFmt w:val="decimal"/>
       <w:lvlText w:val=""/>
       <w:lvlJc w:val="left"/>
     </w:lvl>
-    <w:lvl w:ilvl="7" w:tplc="F33CE546">
+    <w:lvl w:ilvl="6" w:tplc="F176DDD0">
       <w:numFmt w:val="decimal"/>
       <w:lvlText w:val=""/>
       <w:lvlJc w:val="left"/>
     </w:lvl>
-    <w:lvl w:ilvl="8" w:tplc="614E559C">
+    <w:lvl w:ilvl="7" w:tplc="EFAC4FCE">
+      <w:numFmt w:val="decimal"/>
+      <w:lvlText w:val=""/>
+      <w:lvlJc w:val="left"/>
+    </w:lvl>
+    <w:lvl w:ilvl="8" w:tplc="0268AD36">
       <w:numFmt w:val="decimal"/>
       <w:lvlText w:val=""/>
       <w:lvlJc w:val="left"/>
     </w:lvl>
   </w:abstractNum>
-  <w:num w:numId="1" w16cid:durableId="1273248592">
-    <w:abstractNumId w:val="1"/>
-    <w:lvlOverride w:ilvl="0">
-      <w:startOverride w:val="1"/>
-    </w:lvlOverride>
-  </w:num>
-  <w:num w:numId="2" w16cid:durableId="752044971">
+  <w:abstractNum w:abstractNumId="2" w15:restartNumberingAfterBreak="0">
+    <w:nsid w:val="5005191E"/>
+    <w:multiLevelType w:val="hybridMultilevel"/>
+    <w:tmpl w:val="0D1C4F4E"/>
+    <w:lvl w:ilvl="0" w:tplc="B6962FD8" w:tentative="1">
+      <w:start w:val="1"/>
+      <w:numFmt w:val="bullet"/>
+      <w:lvlText w:val="●"/>
+      <w:lvlJc w:val="left"/>
+      <w:pPr>
+        <w:ind w:left="720" w:hanging="360"/>
+      </w:pPr>
+    </w:lvl>
+    <w:lvl w:ilvl="1" w:tplc="E012D0F8" w:tentative="1">
+      <w:start w:val="1"/>
+      <w:numFmt w:val="bullet"/>
+      <w:lvlText w:val="○"/>
+      <w:lvlJc w:val="left"/>
+      <w:pPr>
+        <w:ind w:left="1440" w:hanging="360"/>
+      </w:pPr>
+    </w:lvl>
+    <w:lvl w:ilvl="2" w:tplc="3514B544" w:tentative="1">
+      <w:start w:val="1"/>
+      <w:numFmt w:val="bullet"/>
+      <w:lvlText w:val="■"/>
+      <w:lvlJc w:val="left"/>
+      <w:pPr>
+        <w:ind w:left="2160" w:hanging="360"/>
+      </w:pPr>
+    </w:lvl>
+    <w:lvl w:ilvl="3" w:tplc="A254F2D0" w:tentative="1">
+      <w:start w:val="1"/>
+      <w:numFmt w:val="bullet"/>
+      <w:lvlText w:val="●"/>
+      <w:lvlJc w:val="left"/>
+      <w:pPr>
+        <w:ind w:left="2880" w:hanging="360"/>
+      </w:pPr>
+    </w:lvl>
+    <w:lvl w:ilvl="4" w:tplc="B4500A58" w:tentative="1">
+      <w:start w:val="1"/>
+      <w:numFmt w:val="bullet"/>
+      <w:lvlText w:val="○"/>
+      <w:lvlJc w:val="left"/>
+      <w:pPr>
+        <w:ind w:left="3600" w:hanging="360"/>
+      </w:pPr>
+    </w:lvl>
+    <w:lvl w:ilvl="5" w:tplc="203A9814" w:tentative="1">
+      <w:start w:val="1"/>
+      <w:numFmt w:val="bullet"/>
+      <w:lvlText w:val="■"/>
+      <w:lvlJc w:val="left"/>
+      <w:pPr>
+        <w:ind w:left="4320" w:hanging="360"/>
+      </w:pPr>
+    </w:lvl>
+    <w:lvl w:ilvl="6" w:tplc="E692F82C" w:tentative="1">
+      <w:start w:val="1"/>
+      <w:numFmt w:val="bullet"/>
+      <w:lvlText w:val="●"/>
+      <w:lvlJc w:val="left"/>
+      <w:pPr>
+        <w:ind w:left="5040" w:hanging="360"/>
+      </w:pPr>
+    </w:lvl>
+    <w:lvl w:ilvl="7" w:tplc="5B5A15F2" w:tentative="1">
+      <w:start w:val="1"/>
+      <w:numFmt w:val="bullet"/>
+      <w:lvlText w:val="●"/>
+      <w:lvlJc w:val="left"/>
+      <w:pPr>
+        <w:ind w:left="5760" w:hanging="360"/>
+      </w:pPr>
+    </w:lvl>
+    <w:lvl w:ilvl="8" w:tplc="6A10754C" w:tentative="1">
+      <w:start w:val="1"/>
+      <w:numFmt w:val="bullet"/>
+      <w:lvlText w:val="●"/>
+      <w:lvlJc w:val="left"/>
+      <w:pPr>
+        <w:ind w:left="6480" w:hanging="360"/>
+      </w:pPr>
+    </w:lvl>
+  </w:abstractNum>
+  <w:num w:numId="1" w16cid:durableId="2021350052">
     <w:abstractNumId w:val="2"/>
     <w:lvlOverride w:ilvl="0">
       <w:startOverride w:val="1"/>
     </w:lvlOverride>
   </w:num>
-  <w:num w:numId="3" w16cid:durableId="1149204605">
+  <w:num w:numId="2" w16cid:durableId="857503433">
     <w:abstractNumId w:val="0"/>
+    <w:lvlOverride w:ilvl="0">
+      <w:startOverride w:val="1"/>
+    </w:lvlOverride>
+  </w:num>
+  <w:num w:numId="3" w16cid:durableId="1843858036">
+    <w:abstractNumId w:val="1"/>
     <w:lvlOverride w:ilvl="0">
       <w:startOverride w:val="1"/>
     </w:lvlOverride>

</xml_diff>